<commit_message>
(doc: HU-RF-02 – Autenticación )
</commit_message>
<xml_diff>
--- a/HU-RF-02–Autenticación.docx
+++ b/HU-RF-02–Autenticación.docx
@@ -10,14 +10,64 @@
           <w:numId w:val="1"/>
         </w:numPr>
       </w:pPr>
-      <w:proofErr w:type="gramStart"/>
       <w:r>
-        <w:t>[ ]</w:t>
+        <w:t>[ ] Validar credenciales</w:t>
       </w:r>
-      <w:proofErr w:type="gramEnd"/>
+    </w:p>
+    <w:p>
+      <w:pPr>
+        <w:pStyle w:val="Prrafodelista"/>
+      </w:pPr>
       <w:r>
-        <w:t xml:space="preserve"> Validar credenciales</w:t>
+        <w:drawing>
+          <wp:inline distT="0" distB="0" distL="0" distR="0" wp14:anchorId="78299430" wp14:editId="573F0857">
+            <wp:extent cx="5612130" cy="2679065"/>
+            <wp:effectExtent l="0" t="0" r="7620" b="6985"/>
+            <wp:docPr id="1579887770" name="Imagen 1"/>
+            <wp:cNvGraphicFramePr>
+              <a:graphicFrameLocks xmlns:a="http://schemas.openxmlformats.org/drawingml/2006/main" noChangeAspect="1"/>
+            </wp:cNvGraphicFramePr>
+            <a:graphic xmlns:a="http://schemas.openxmlformats.org/drawingml/2006/main">
+              <a:graphicData uri="http://schemas.openxmlformats.org/drawingml/2006/picture">
+                <pic:pic xmlns:pic="http://schemas.openxmlformats.org/drawingml/2006/picture">
+                  <pic:nvPicPr>
+                    <pic:cNvPr id="1579887770" name=""/>
+                    <pic:cNvPicPr/>
+                  </pic:nvPicPr>
+                  <pic:blipFill>
+                    <a:blip r:embed="rId5"/>
+                    <a:stretch>
+                      <a:fillRect/>
+                    </a:stretch>
+                  </pic:blipFill>
+                  <pic:spPr>
+                    <a:xfrm>
+                      <a:off x="0" y="0"/>
+                      <a:ext cx="5612130" cy="2679065"/>
+                    </a:xfrm>
+                    <a:prstGeom prst="rect">
+                      <a:avLst/>
+                    </a:prstGeom>
+                  </pic:spPr>
+                </pic:pic>
+              </a:graphicData>
+            </a:graphic>
+          </wp:inline>
+        </w:drawing>
       </w:r>
+    </w:p>
+    <w:p>
+      <w:pPr>
+        <w:pStyle w:val="Prrafodelista"/>
+      </w:pPr>
+      <w:r>
+        <w:t>Ya que todas las credenciales están bien genera el token</w:t>
+      </w:r>
+    </w:p>
+    <w:p>
+      <w:pPr>
+        <w:pStyle w:val="Prrafodelista"/>
+      </w:pPr>
     </w:p>
     <w:p>
       <w:pPr>
@@ -48,6 +98,117 @@
       <w:pPr>
         <w:pStyle w:val="Prrafodelista"/>
       </w:pPr>
+      <w:r>
+        <w:drawing>
+          <wp:inline distT="0" distB="0" distL="0" distR="0" wp14:anchorId="35920246" wp14:editId="2448872D">
+            <wp:extent cx="5612130" cy="3309620"/>
+            <wp:effectExtent l="0" t="0" r="7620" b="5080"/>
+            <wp:docPr id="249782134" name="Imagen 1"/>
+            <wp:cNvGraphicFramePr>
+              <a:graphicFrameLocks xmlns:a="http://schemas.openxmlformats.org/drawingml/2006/main" noChangeAspect="1"/>
+            </wp:cNvGraphicFramePr>
+            <a:graphic xmlns:a="http://schemas.openxmlformats.org/drawingml/2006/main">
+              <a:graphicData uri="http://schemas.openxmlformats.org/drawingml/2006/picture">
+                <pic:pic xmlns:pic="http://schemas.openxmlformats.org/drawingml/2006/picture">
+                  <pic:nvPicPr>
+                    <pic:cNvPr id="249782134" name=""/>
+                    <pic:cNvPicPr/>
+                  </pic:nvPicPr>
+                  <pic:blipFill>
+                    <a:blip r:embed="rId6"/>
+                    <a:stretch>
+                      <a:fillRect/>
+                    </a:stretch>
+                  </pic:blipFill>
+                  <pic:spPr>
+                    <a:xfrm>
+                      <a:off x="0" y="0"/>
+                      <a:ext cx="5612130" cy="3309620"/>
+                    </a:xfrm>
+                    <a:prstGeom prst="rect">
+                      <a:avLst/>
+                    </a:prstGeom>
+                  </pic:spPr>
+                </pic:pic>
+              </a:graphicData>
+            </a:graphic>
+          </wp:inline>
+        </w:drawing>
+      </w:r>
+    </w:p>
+    <w:p>
+      <w:pPr>
+        <w:ind w:left="360"/>
+      </w:pPr>
+      <w:r>
+        <w:t>Muestra el error 403 que nos indicaría que las credenciales están mal</w:t>
+      </w:r>
+    </w:p>
+    <w:p>
+      <w:pPr>
+        <w:ind w:left="360"/>
+      </w:pPr>
+    </w:p>
+    <w:p>
+      <w:pPr>
+        <w:ind w:left="360"/>
+      </w:pPr>
+      <w:r>
+        <w:lastRenderedPageBreak/>
+        <w:drawing>
+          <wp:inline distT="0" distB="0" distL="0" distR="0" wp14:anchorId="27111424" wp14:editId="68E94DF9">
+            <wp:extent cx="5612130" cy="3845560"/>
+            <wp:effectExtent l="0" t="0" r="7620" b="2540"/>
+            <wp:docPr id="1174211774" name="Imagen 1"/>
+            <wp:cNvGraphicFramePr>
+              <a:graphicFrameLocks xmlns:a="http://schemas.openxmlformats.org/drawingml/2006/main" noChangeAspect="1"/>
+            </wp:cNvGraphicFramePr>
+            <a:graphic xmlns:a="http://schemas.openxmlformats.org/drawingml/2006/main">
+              <a:graphicData uri="http://schemas.openxmlformats.org/drawingml/2006/picture">
+                <pic:pic xmlns:pic="http://schemas.openxmlformats.org/drawingml/2006/picture">
+                  <pic:nvPicPr>
+                    <pic:cNvPr id="1174211774" name=""/>
+                    <pic:cNvPicPr/>
+                  </pic:nvPicPr>
+                  <pic:blipFill>
+                    <a:blip r:embed="rId7"/>
+                    <a:stretch>
+                      <a:fillRect/>
+                    </a:stretch>
+                  </pic:blipFill>
+                  <pic:spPr>
+                    <a:xfrm>
+                      <a:off x="0" y="0"/>
+                      <a:ext cx="5612130" cy="3845560"/>
+                    </a:xfrm>
+                    <a:prstGeom prst="rect">
+                      <a:avLst/>
+                    </a:prstGeom>
+                  </pic:spPr>
+                </pic:pic>
+              </a:graphicData>
+            </a:graphic>
+          </wp:inline>
+        </w:drawing>
+      </w:r>
+    </w:p>
+    <w:p>
+      <w:pPr>
+        <w:ind w:left="360"/>
+      </w:pPr>
+      <w:r>
+        <w:t>Observamos con el token de un admin que este logueado y miramos que en bitácora se guardo el login fallodo</w:t>
+      </w:r>
+    </w:p>
+    <w:p>
+      <w:pPr>
+        <w:ind w:left="360"/>
+      </w:pPr>
+    </w:p>
+    <w:p>
+      <w:pPr>
+        <w:pStyle w:val="Prrafodelista"/>
+      </w:pPr>
     </w:p>
     <w:p>
       <w:pPr>
@@ -57,13 +218,8 @@
           <w:numId w:val="1"/>
         </w:numPr>
       </w:pPr>
-      <w:proofErr w:type="gramStart"/>
       <w:r>
-        <w:t>[ ]</w:t>
-      </w:r>
-      <w:proofErr w:type="gramEnd"/>
-      <w:r>
-        <w:t xml:space="preserve"> Aplica control de sesiones activas.</w:t>
+        <w:t>[ ] Aplica control de sesiones activas.</w:t>
       </w:r>
     </w:p>
     <w:p>
@@ -79,14 +235,134 @@
           <w:numId w:val="1"/>
         </w:numPr>
       </w:pPr>
-      <w:proofErr w:type="gramStart"/>
       <w:r>
-        <w:t>[ ]</w:t>
+        <w:t>[ ] Registra intento en bitácora.</w:t>
       </w:r>
-      <w:proofErr w:type="gramEnd"/>
+    </w:p>
+    <w:p>
+      <w:pPr>
+        <w:pStyle w:val="Prrafodelista"/>
+      </w:pPr>
+    </w:p>
+    <w:p>
+      <w:pPr>
+        <w:pStyle w:val="Prrafodelista"/>
+        <w:rPr>
+          <w:noProof/>
+        </w:rPr>
+      </w:pPr>
+    </w:p>
+    <w:p>
+      <w:pPr>
+        <w:pStyle w:val="Prrafodelista"/>
+      </w:pPr>
       <w:r>
-        <w:t xml:space="preserve"> Registra intento en bitácora.</w:t>
+        <w:rPr>
+          <w:noProof/>
+        </w:rPr>
+        <w:lastRenderedPageBreak/>
+        <w:drawing>
+          <wp:inline distT="0" distB="0" distL="0" distR="0" wp14:anchorId="0D68D75F" wp14:editId="4E7F0D1D">
+            <wp:extent cx="5612130" cy="2931795"/>
+            <wp:effectExtent l="0" t="0" r="7620" b="1905"/>
+            <wp:docPr id="231198933" name="Imagen 1"/>
+            <wp:cNvGraphicFramePr>
+              <a:graphicFrameLocks xmlns:a="http://schemas.openxmlformats.org/drawingml/2006/main" noChangeAspect="1"/>
+            </wp:cNvGraphicFramePr>
+            <a:graphic xmlns:a="http://schemas.openxmlformats.org/drawingml/2006/main">
+              <a:graphicData uri="http://schemas.openxmlformats.org/drawingml/2006/picture">
+                <pic:pic xmlns:pic="http://schemas.openxmlformats.org/drawingml/2006/picture">
+                  <pic:nvPicPr>
+                    <pic:cNvPr id="231198933" name=""/>
+                    <pic:cNvPicPr/>
+                  </pic:nvPicPr>
+                  <pic:blipFill>
+                    <a:blip r:embed="rId8"/>
+                    <a:stretch>
+                      <a:fillRect/>
+                    </a:stretch>
+                  </pic:blipFill>
+                  <pic:spPr>
+                    <a:xfrm>
+                      <a:off x="0" y="0"/>
+                      <a:ext cx="5612130" cy="2931795"/>
+                    </a:xfrm>
+                    <a:prstGeom prst="rect">
+                      <a:avLst/>
+                    </a:prstGeom>
+                  </pic:spPr>
+                </pic:pic>
+              </a:graphicData>
+            </a:graphic>
+          </wp:inline>
+        </w:drawing>
       </w:r>
+    </w:p>
+    <w:p>
+      <w:pPr>
+        <w:pStyle w:val="Prrafodelista"/>
+      </w:pPr>
+      <w:r>
+        <w:t xml:space="preserve">Realizamos el login y copiamos el token </w:t>
+      </w:r>
+    </w:p>
+    <w:p>
+      <w:pPr>
+        <w:pStyle w:val="Prrafodelista"/>
+      </w:pPr>
+      <w:r>
+        <w:rPr>
+          <w:noProof/>
+        </w:rPr>
+        <w:drawing>
+          <wp:inline distT="0" distB="0" distL="0" distR="0" wp14:anchorId="5A226F33" wp14:editId="129E6F7A">
+            <wp:extent cx="5612130" cy="2931795"/>
+            <wp:effectExtent l="0" t="0" r="7620" b="1905"/>
+            <wp:docPr id="1059175659" name="Imagen 1"/>
+            <wp:cNvGraphicFramePr>
+              <a:graphicFrameLocks xmlns:a="http://schemas.openxmlformats.org/drawingml/2006/main" noChangeAspect="1"/>
+            </wp:cNvGraphicFramePr>
+            <a:graphic xmlns:a="http://schemas.openxmlformats.org/drawingml/2006/main">
+              <a:graphicData uri="http://schemas.openxmlformats.org/drawingml/2006/picture">
+                <pic:pic xmlns:pic="http://schemas.openxmlformats.org/drawingml/2006/picture">
+                  <pic:nvPicPr>
+                    <pic:cNvPr id="1059175659" name=""/>
+                    <pic:cNvPicPr/>
+                  </pic:nvPicPr>
+                  <pic:blipFill>
+                    <a:blip r:embed="rId8"/>
+                    <a:stretch>
+                      <a:fillRect/>
+                    </a:stretch>
+                  </pic:blipFill>
+                  <pic:spPr>
+                    <a:xfrm>
+                      <a:off x="0" y="0"/>
+                      <a:ext cx="5612130" cy="2931795"/>
+                    </a:xfrm>
+                    <a:prstGeom prst="rect">
+                      <a:avLst/>
+                    </a:prstGeom>
+                  </pic:spPr>
+                </pic:pic>
+              </a:graphicData>
+            </a:graphic>
+          </wp:inline>
+        </w:drawing>
+      </w:r>
+    </w:p>
+    <w:p>
+      <w:pPr>
+        <w:pStyle w:val="Prrafodelista"/>
+      </w:pPr>
+      <w:r>
+        <w:t xml:space="preserve">Con el token de admin verificamos si se guardo el login exitoso </w:t>
+      </w:r>
+    </w:p>
+    <w:p>
+      <w:pPr>
+        <w:pStyle w:val="Prrafodelista"/>
+      </w:pPr>
     </w:p>
     <w:p/>
     <w:sectPr>

</xml_diff>